<commit_message>
moved some files, minor update to main text
</commit_message>
<xml_diff>
--- a/ms-2026-02-12.docx
+++ b/ms-2026-02-12.docx
@@ -1684,6 +1684,16 @@
       </w:pPr>
       <w:r>
         <w:rPr/>
+        <w:t>Inderesting – ID_K lagging strand enrichment related to POLE</w:t>
+      </w:r>
+    </w:p>
+    <w:p>
+      <w:pPr>
+        <w:pStyle w:val="Normal"/>
+        <w:rPr/>
+      </w:pPr>
+      <w:r>
+        <w:rPr/>
         <w:t xml:space="preserve">We evaluated the interplay between our the 83-type signatures that we identified and several genomic topographical features. Transcription-coupled nucleotide excision repair was known to cause transcription strand asymmetries, </w:t>
       </w:r>
       <w:r>
@@ -2215,16 +2225,9 @@
           <w:spacing w:val="0"/>
           <w:sz w:val="23"/>
         </w:rPr>
-        <w:t>Lymphoid::CPCT02120032T</w:t>
-      </w:r>
-    </w:p>
-    <w:p>
-      <w:pPr>
-        <w:pStyle w:val="Normal"/>
-        <w:numPr>
-          <w:ilvl w:val="0"/>
-          <w:numId w:val="3"/>
-        </w:numPr>
+        <w:t>Lymphoid::CPCT02120032T /</w:t>
+      </w:r>
+      <w:r>
         <w:rPr>
           <w:rFonts w:ascii="system-ui;apple-system;Segoe UI;Roboto;Helvetica Neue;Noto Sans;Liberation Sans;Arial;sans-serif;Apple Color Emoji;Segoe UI Emoji;Segoe UI Symbol;Noto Color Emoji" w:hAnsi="system-ui;apple-system;Segoe UI;Roboto;Helvetica Neue;Noto Sans;Liberation Sans;Arial;sans-serif;Apple Color Emoji;Segoe UI Emoji;Segoe UI Symbol;Noto Color Emoji"/>
           <w:b w:val="false"/>
@@ -2234,8 +2237,10 @@
           <w:color w:val="212529"/>
           <w:spacing w:val="0"/>
           <w:sz w:val="23"/>
-        </w:rPr>
-      </w:pPr>
+          <w:shd w:fill="FFFF00" w:val="clear"/>
+        </w:rPr>
+        <w:t xml:space="preserve"> </w:t>
+      </w:r>
       <w:r>
         <w:rPr>
           <w:rFonts w:ascii="system-ui;apple-system;Segoe UI;Roboto;Helvetica Neue;Noto Sans;Liberation Sans;Arial;sans-serif;Apple Color Emoji;Segoe UI Emoji;Segoe UI Symbol;Noto Color Emoji" w:hAnsi="system-ui;apple-system;Segoe UI;Roboto;Helvetica Neue;Noto Sans;Liberation Sans;Arial;sans-serif;Apple Color Emoji;Segoe UI Emoji;Segoe UI Symbol;Noto Color Emoji"/>
@@ -2246,10 +2251,18 @@
           <w:color w:val="212529"/>
           <w:spacing w:val="0"/>
           <w:sz w:val="23"/>
-        </w:rPr>
-        <w:t xml:space="preserve">7 somewhat impovershed for G….., peaks at R8/9; some insT, some del2:u2:R5/9, Ins2:u2(R5,9) – do these really go higher? Look at </w:t>
-      </w:r>
-      <w:r>
+          <w:shd w:fill="FFFF00" w:val="clear"/>
+        </w:rPr>
+        <w:t>maybe look at the  del&gt;=2</w:t>
+      </w:r>
+    </w:p>
+    <w:p>
+      <w:pPr>
+        <w:pStyle w:val="Normal"/>
+        <w:numPr>
+          <w:ilvl w:val="0"/>
+          <w:numId w:val="3"/>
+        </w:numPr>
         <w:rPr>
           <w:rFonts w:ascii="system-ui;apple-system;Segoe UI;Roboto;Helvetica Neue;Noto Sans;Liberation Sans;Arial;sans-serif;Apple Color Emoji;Segoe UI Emoji;Segoe UI Symbol;Noto Color Emoji" w:hAnsi="system-ui;apple-system;Segoe UI;Roboto;Helvetica Neue;Noto Sans;Liberation Sans;Arial;sans-serif;Apple Color Emoji;Segoe UI Emoji;Segoe UI Symbol;Noto Color Emoji"/>
           <w:b w:val="false"/>
@@ -2260,16 +2273,8 @@
           <w:spacing w:val="0"/>
           <w:sz w:val="23"/>
         </w:rPr>
-        <w:t>Uterus::SP94741</w:t>
-      </w:r>
-    </w:p>
-    <w:p>
-      <w:pPr>
-        <w:pStyle w:val="Normal"/>
-        <w:numPr>
-          <w:ilvl w:val="0"/>
-          <w:numId w:val="3"/>
-        </w:numPr>
+      </w:pPr>
+      <w:r>
         <w:rPr>
           <w:rFonts w:ascii="system-ui;apple-system;Segoe UI;Roboto;Helvetica Neue;Noto Sans;Liberation Sans;Arial;sans-serif;Apple Color Emoji;Segoe UI Emoji;Segoe UI Symbol;Noto Color Emoji" w:hAnsi="system-ui;apple-system;Segoe UI;Roboto;Helvetica Neue;Noto Sans;Liberation Sans;Arial;sans-serif;Apple Color Emoji;Segoe UI Emoji;Segoe UI Symbol;Noto Color Emoji"/>
           <w:b w:val="false"/>
@@ -2280,7 +2285,8 @@
           <w:spacing w:val="0"/>
           <w:sz w:val="23"/>
         </w:rPr>
-      </w:pPr>
+        <w:t>7 somewhat impovershed for G….., peaks at R8/9; some insT, some del2:u2:R5/9, Ins2:u2(R5,9) – do these really go higher? Look at Uterus::SP94741/</w:t>
+      </w:r>
       <w:r>
         <w:rPr>
           <w:rFonts w:ascii="system-ui;apple-system;Segoe UI;Roboto;Helvetica Neue;Noto Sans;Liberation Sans;Arial;sans-serif;Apple Color Emoji;Segoe UI Emoji;Segoe UI Symbol;Noto Color Emoji" w:hAnsi="system-ui;apple-system;Segoe UI;Roboto;Helvetica Neue;Noto Sans;Liberation Sans;Arial;sans-serif;Apple Color Emoji;Segoe UI Emoji;Segoe UI Symbol;Noto Color Emoji"/>
@@ -2291,17 +2297,11 @@
           <w:color w:val="212529"/>
           <w:spacing w:val="0"/>
           <w:sz w:val="23"/>
-        </w:rPr>
-        <w:t>J T del in longest class of poly T, 2 bp deletions in very long 2-bp tracts; differs from N because of del of 2 in 5 and 6+ and presence of del3 / 4 repeats and Del4 3 repeats</w:t>
-      </w:r>
-    </w:p>
-    <w:p>
-      <w:pPr>
-        <w:pStyle w:val="Normal"/>
-        <w:numPr>
-          <w:ilvl w:val="0"/>
-          <w:numId w:val="3"/>
-        </w:numPr>
+          <w:shd w:fill="FFFF00" w:val="clear"/>
+        </w:rPr>
+        <w:t xml:space="preserve"> </w:t>
+      </w:r>
+      <w:r>
         <w:rPr>
           <w:rFonts w:ascii="system-ui;apple-system;Segoe UI;Roboto;Helvetica Neue;Noto Sans;Liberation Sans;Arial;sans-serif;Apple Color Emoji;Segoe UI Emoji;Segoe UI Symbol;Noto Color Emoji" w:hAnsi="system-ui;apple-system;Segoe UI;Roboto;Helvetica Neue;Noto Sans;Liberation Sans;Arial;sans-serif;Apple Color Emoji;Segoe UI Emoji;Segoe UI Symbol;Noto Color Emoji"/>
           <w:b w:val="false"/>
@@ -2311,9 +2311,18 @@
           <w:color w:val="212529"/>
           <w:spacing w:val="0"/>
           <w:sz w:val="23"/>
-        </w:rPr>
-      </w:pPr>
-      <w:r>
+          <w:shd w:fill="FFFF00" w:val="clear"/>
+        </w:rPr>
+        <w:t>maybe look at the  del&gt;=2</w:t>
+      </w:r>
+    </w:p>
+    <w:p>
+      <w:pPr>
+        <w:pStyle w:val="Normal"/>
+        <w:numPr>
+          <w:ilvl w:val="0"/>
+          <w:numId w:val="3"/>
+        </w:numPr>
         <w:rPr>
           <w:rFonts w:ascii="system-ui;apple-system;Segoe UI;Roboto;Helvetica Neue;Noto Sans;Liberation Sans;Arial;sans-serif;Apple Color Emoji;Segoe UI Emoji;Segoe UI Symbol;Noto Color Emoji" w:hAnsi="system-ui;apple-system;Segoe UI;Roboto;Helvetica Neue;Noto Sans;Liberation Sans;Arial;sans-serif;Apple Color Emoji;Segoe UI Emoji;Segoe UI Symbol;Noto Color Emoji"/>
           <w:b w:val="false"/>
@@ -2324,16 +2333,8 @@
           <w:spacing w:val="0"/>
           <w:sz w:val="23"/>
         </w:rPr>
-        <w:t>InsDel_O, ins T in longest 2 groups, plus ins2:U2:R5+</w:t>
-      </w:r>
-    </w:p>
-    <w:p>
-      <w:pPr>
-        <w:pStyle w:val="Normal"/>
-        <w:numPr>
-          <w:ilvl w:val="0"/>
-          <w:numId w:val="3"/>
-        </w:numPr>
+      </w:pPr>
+      <w:r>
         <w:rPr>
           <w:rFonts w:ascii="system-ui;apple-system;Segoe UI;Roboto;Helvetica Neue;Noto Sans;Liberation Sans;Arial;sans-serif;Apple Color Emoji;Segoe UI Emoji;Segoe UI Symbol;Noto Color Emoji" w:hAnsi="system-ui;apple-system;Segoe UI;Roboto;Helvetica Neue;Noto Sans;Liberation Sans;Arial;sans-serif;Apple Color Emoji;Segoe UI Emoji;Segoe UI Symbol;Noto Color Emoji"/>
           <w:b w:val="false"/>
@@ -2344,7 +2345,8 @@
           <w:spacing w:val="0"/>
           <w:sz w:val="23"/>
         </w:rPr>
-      </w:pPr>
+        <w:t xml:space="preserve">J T del in longest class of poly T, 2 bp deletions in very long 2-bp tracts; differs from N because of del of 2 in 5 and 6+ and presence of del3 / 4 repeats and Del4 3 repeats </w:t>
+      </w:r>
       <w:r>
         <w:rPr>
           <w:rFonts w:ascii="system-ui;apple-system;Segoe UI;Roboto;Helvetica Neue;Noto Sans;Liberation Sans;Arial;sans-serif;Apple Color Emoji;Segoe UI Emoji;Segoe UI Symbol;Noto Color Emoji" w:hAnsi="system-ui;apple-system;Segoe UI;Roboto;Helvetica Neue;Noto Sans;Liberation Sans;Arial;sans-serif;Apple Color Emoji;Segoe UI Emoji;Segoe UI Symbol;Noto Color Emoji"/>
@@ -2355,12 +2357,11 @@
           <w:color w:val="212529"/>
           <w:spacing w:val="0"/>
           <w:sz w:val="23"/>
-        </w:rPr>
-      </w:r>
-    </w:p>
-    <w:p>
-      <w:pPr>
-        <w:pStyle w:val="Normal"/>
+          <w:shd w:fill="FF4000" w:val="clear"/>
+        </w:rPr>
+        <w:t>definitely</w:t>
+      </w:r>
+      <w:r>
         <w:rPr>
           <w:rFonts w:ascii="system-ui;apple-system;Segoe UI;Roboto;Helvetica Neue;Noto Sans;Liberation Sans;Arial;sans-serif;Apple Color Emoji;Segoe UI Emoji;Segoe UI Symbol;Noto Color Emoji" w:hAnsi="system-ui;apple-system;Segoe UI;Roboto;Helvetica Neue;Noto Sans;Liberation Sans;Arial;sans-serif;Apple Color Emoji;Segoe UI Emoji;Segoe UI Symbol;Noto Color Emoji"/>
           <w:b w:val="false"/>
@@ -2370,9 +2371,18 @@
           <w:color w:val="212529"/>
           <w:spacing w:val="0"/>
           <w:sz w:val="23"/>
-        </w:rPr>
-      </w:pPr>
-      <w:r>
+          <w:shd w:fill="FF4000" w:val="clear"/>
+        </w:rPr>
+        <w:t xml:space="preserve"> look at the  del&gt;=2 also for N</w:t>
+      </w:r>
+    </w:p>
+    <w:p>
+      <w:pPr>
+        <w:pStyle w:val="Normal"/>
+        <w:numPr>
+          <w:ilvl w:val="0"/>
+          <w:numId w:val="3"/>
+        </w:numPr>
         <w:rPr>
           <w:rFonts w:ascii="system-ui;apple-system;Segoe UI;Roboto;Helvetica Neue;Noto Sans;Liberation Sans;Arial;sans-serif;Apple Color Emoji;Segoe UI Emoji;Segoe UI Symbol;Noto Color Emoji" w:hAnsi="system-ui;apple-system;Segoe UI;Roboto;Helvetica Neue;Noto Sans;Liberation Sans;Arial;sans-serif;Apple Color Emoji;Segoe UI Emoji;Segoe UI Symbol;Noto Color Emoji"/>
           <w:b w:val="false"/>
@@ -2383,33 +2393,267 @@
           <w:spacing w:val="0"/>
           <w:sz w:val="23"/>
         </w:rPr>
-      </w:r>
-    </w:p>
-    <w:p>
-      <w:pPr>
-        <w:pStyle w:val="Normal"/>
-        <w:rPr/>
-      </w:pPr>
-      <w:r>
-        <w:rPr/>
-      </w:r>
-    </w:p>
-    <w:p>
-      <w:pPr>
-        <w:pStyle w:val="Normal"/>
-        <w:rPr/>
-      </w:pPr>
-      <w:r>
-        <w:rPr/>
-        <w:t>look a</w:t>
-      </w:r>
-      <w:r>
-        <w:rPr/>
-        <w:t>t</w:t>
-      </w:r>
-      <w:r>
-        <w:rPr/>
-        <w:t xml:space="preserve"> pattern in longer dels in J and  O</w:t>
+      </w:pPr>
+      <w:r>
+        <w:rPr>
+          <w:rFonts w:ascii="system-ui;apple-system;Segoe UI;Roboto;Helvetica Neue;Noto Sans;Liberation Sans;Arial;sans-serif;Apple Color Emoji;Segoe UI Emoji;Segoe UI Symbol;Noto Color Emoji" w:hAnsi="system-ui;apple-system;Segoe UI;Roboto;Helvetica Neue;Noto Sans;Liberation Sans;Arial;sans-serif;Apple Color Emoji;Segoe UI Emoji;Segoe UI Symbol;Noto Color Emoji"/>
+          <w:b w:val="false"/>
+          <w:i w:val="false"/>
+          <w:caps w:val="false"/>
+          <w:smallCaps w:val="false"/>
+          <w:color w:val="212529"/>
+          <w:spacing w:val="0"/>
+          <w:sz w:val="23"/>
+        </w:rPr>
+        <w:t xml:space="preserve">K_beta – POLE …. </w:t>
+      </w:r>
+    </w:p>
+    <w:p>
+      <w:pPr>
+        <w:pStyle w:val="Normal"/>
+        <w:numPr>
+          <w:ilvl w:val="0"/>
+          <w:numId w:val="3"/>
+        </w:numPr>
+        <w:rPr>
+          <w:rFonts w:ascii="system-ui;apple-system;Segoe UI;Roboto;Helvetica Neue;Noto Sans;Liberation Sans;Arial;sans-serif;Apple Color Emoji;Segoe UI Emoji;Segoe UI Symbol;Noto Color Emoji" w:hAnsi="system-ui;apple-system;Segoe UI;Roboto;Helvetica Neue;Noto Sans;Liberation Sans;Arial;sans-serif;Apple Color Emoji;Segoe UI Emoji;Segoe UI Symbol;Noto Color Emoji"/>
+          <w:b w:val="false"/>
+          <w:i w:val="false"/>
+          <w:caps w:val="false"/>
+          <w:smallCaps w:val="false"/>
+          <w:color w:val="212529"/>
+          <w:spacing w:val="0"/>
+          <w:sz w:val="23"/>
+        </w:rPr>
+      </w:pPr>
+      <w:r>
+        <w:rPr>
+          <w:rFonts w:ascii="system-ui;apple-system;Segoe UI;Roboto;Helvetica Neue;Noto Sans;Liberation Sans;Arial;sans-serif;Apple Color Emoji;Segoe UI Emoji;Segoe UI Symbol;Noto Color Emoji" w:hAnsi="system-ui;apple-system;Segoe UI;Roboto;Helvetica Neue;Noto Sans;Liberation Sans;Arial;sans-serif;Apple Color Emoji;Segoe UI Emoji;Segoe UI Symbol;Noto Color Emoji"/>
+          <w:b w:val="false"/>
+          <w:i w:val="false"/>
+          <w:caps w:val="false"/>
+          <w:smallCaps w:val="false"/>
+          <w:color w:val="212529"/>
+          <w:spacing w:val="0"/>
+          <w:sz w:val="23"/>
+        </w:rPr>
+        <w:t xml:space="preserve">InsDel_O, ins T in longest 2 groups, plus ins2:U2:R5+ </w:t>
+      </w:r>
+      <w:r>
+        <w:rPr>
+          <w:rFonts w:ascii="system-ui;apple-system;Segoe UI;Roboto;Helvetica Neue;Noto Sans;Liberation Sans;Arial;sans-serif;Apple Color Emoji;Segoe UI Emoji;Segoe UI Symbol;Noto Color Emoji" w:hAnsi="system-ui;apple-system;Segoe UI;Roboto;Helvetica Neue;Noto Sans;Liberation Sans;Arial;sans-serif;Apple Color Emoji;Segoe UI Emoji;Segoe UI Symbol;Noto Color Emoji"/>
+          <w:b w:val="false"/>
+          <w:i w:val="false"/>
+          <w:caps w:val="false"/>
+          <w:smallCaps w:val="false"/>
+          <w:color w:val="212529"/>
+          <w:spacing w:val="0"/>
+          <w:sz w:val="23"/>
+          <w:shd w:fill="FF4000" w:val="clear"/>
+        </w:rPr>
+        <w:t xml:space="preserve">definitely look at the  </w:t>
+      </w:r>
+      <w:r>
+        <w:rPr>
+          <w:rFonts w:ascii="system-ui;apple-system;Segoe UI;Roboto;Helvetica Neue;Noto Sans;Liberation Sans;Arial;sans-serif;Apple Color Emoji;Segoe UI Emoji;Segoe UI Symbol;Noto Color Emoji" w:hAnsi="system-ui;apple-system;Segoe UI;Roboto;Helvetica Neue;Noto Sans;Liberation Sans;Arial;sans-serif;Apple Color Emoji;Segoe UI Emoji;Segoe UI Symbol;Noto Color Emoji"/>
+          <w:b w:val="false"/>
+          <w:i w:val="false"/>
+          <w:caps w:val="false"/>
+          <w:smallCaps w:val="false"/>
+          <w:color w:val="212529"/>
+          <w:spacing w:val="0"/>
+          <w:sz w:val="23"/>
+          <w:shd w:fill="FF4000" w:val="clear"/>
+        </w:rPr>
+        <w:t>i</w:t>
+      </w:r>
+      <w:r>
+        <w:rPr>
+          <w:rFonts w:ascii="system-ui;apple-system;Segoe UI;Roboto;Helvetica Neue;Noto Sans;Liberation Sans;Arial;sans-serif;Apple Color Emoji;Segoe UI Emoji;Segoe UI Symbol;Noto Color Emoji" w:hAnsi="system-ui;apple-system;Segoe UI;Roboto;Helvetica Neue;Noto Sans;Liberation Sans;Arial;sans-serif;Apple Color Emoji;Segoe UI Emoji;Segoe UI Symbol;Noto Color Emoji"/>
+          <w:b w:val="false"/>
+          <w:i w:val="false"/>
+          <w:caps w:val="false"/>
+          <w:smallCaps w:val="false"/>
+          <w:color w:val="212529"/>
+          <w:spacing w:val="0"/>
+          <w:sz w:val="23"/>
+          <w:shd w:fill="FF4000" w:val="clear"/>
+        </w:rPr>
+        <w:t>n</w:t>
+      </w:r>
+      <w:r>
+        <w:rPr>
+          <w:rFonts w:ascii="system-ui;apple-system;Segoe UI;Roboto;Helvetica Neue;Noto Sans;Liberation Sans;Arial;sans-serif;Apple Color Emoji;Segoe UI Emoji;Segoe UI Symbol;Noto Color Emoji" w:hAnsi="system-ui;apple-system;Segoe UI;Roboto;Helvetica Neue;Noto Sans;Liberation Sans;Arial;sans-serif;Apple Color Emoji;Segoe UI Emoji;Segoe UI Symbol;Noto Color Emoji"/>
+          <w:b w:val="false"/>
+          <w:i w:val="false"/>
+          <w:caps w:val="false"/>
+          <w:smallCaps w:val="false"/>
+          <w:color w:val="212529"/>
+          <w:spacing w:val="0"/>
+          <w:sz w:val="23"/>
+          <w:shd w:fill="FF4000" w:val="clear"/>
+        </w:rPr>
+        <w:t>s</w:t>
+      </w:r>
+      <w:r>
+        <w:rPr>
+          <w:rFonts w:ascii="system-ui;apple-system;Segoe UI;Roboto;Helvetica Neue;Noto Sans;Liberation Sans;Arial;sans-serif;Apple Color Emoji;Segoe UI Emoji;Segoe UI Symbol;Noto Color Emoji" w:hAnsi="system-ui;apple-system;Segoe UI;Roboto;Helvetica Neue;Noto Sans;Liberation Sans;Arial;sans-serif;Apple Color Emoji;Segoe UI Emoji;Segoe UI Symbol;Noto Color Emoji"/>
+          <w:b w:val="false"/>
+          <w:i w:val="false"/>
+          <w:caps w:val="false"/>
+          <w:smallCaps w:val="false"/>
+          <w:color w:val="212529"/>
+          <w:spacing w:val="0"/>
+          <w:sz w:val="23"/>
+          <w:shd w:fill="FF4000" w:val="clear"/>
+        </w:rPr>
+        <w:t>&gt;=2 also for N</w:t>
+      </w:r>
+    </w:p>
+    <w:p>
+      <w:pPr>
+        <w:pStyle w:val="Normal"/>
+        <w:numPr>
+          <w:ilvl w:val="0"/>
+          <w:numId w:val="3"/>
+        </w:numPr>
+        <w:rPr>
+          <w:rFonts w:ascii="system-ui;apple-system;Segoe UI;Roboto;Helvetica Neue;Noto Sans;Liberation Sans;Arial;sans-serif;Apple Color Emoji;Segoe UI Emoji;Segoe UI Symbol;Noto Color Emoji" w:hAnsi="system-ui;apple-system;Segoe UI;Roboto;Helvetica Neue;Noto Sans;Liberation Sans;Arial;sans-serif;Apple Color Emoji;Segoe UI Emoji;Segoe UI Symbol;Noto Color Emoji"/>
+          <w:b w:val="false"/>
+          <w:i w:val="false"/>
+          <w:caps w:val="false"/>
+          <w:smallCaps w:val="false"/>
+          <w:color w:val="212529"/>
+          <w:spacing w:val="0"/>
+          <w:sz w:val="23"/>
+          <w:highlight w:val="none"/>
+          <w:shd w:fill="auto" w:val="clear"/>
+        </w:rPr>
+      </w:pPr>
+      <w:r>
+        <w:rPr>
+          <w:rFonts w:ascii="system-ui;apple-system;Segoe UI;Roboto;Helvetica Neue;Noto Sans;Liberation Sans;Arial;sans-serif;Apple Color Emoji;Segoe UI Emoji;Segoe UI Symbol;Noto Color Emoji" w:hAnsi="system-ui;apple-system;Segoe UI;Roboto;Helvetica Neue;Noto Sans;Liberation Sans;Arial;sans-serif;Apple Color Emoji;Segoe UI Emoji;Segoe UI Symbol;Noto Color Emoji"/>
+          <w:b w:val="false"/>
+          <w:i w:val="false"/>
+          <w:caps w:val="false"/>
+          <w:smallCaps w:val="false"/>
+          <w:color w:val="212529"/>
+          <w:spacing w:val="0"/>
+          <w:sz w:val="23"/>
+          <w:shd w:fill="auto" w:val="clear"/>
+        </w:rPr>
+        <w:t>InsDelP ~= InD21, MMR + POLE</w:t>
+      </w:r>
+    </w:p>
+    <w:p>
+      <w:pPr>
+        <w:pStyle w:val="Normal"/>
+        <w:numPr>
+          <w:ilvl w:val="0"/>
+          <w:numId w:val="0"/>
+        </w:numPr>
+        <w:ind w:hanging="0" w:left="0"/>
+        <w:rPr>
+          <w:rFonts w:ascii="system-ui;apple-system;Segoe UI;Roboto;Helvetica Neue;Noto Sans;Liberation Sans;Arial;sans-serif;Apple Color Emoji;Segoe UI Emoji;Segoe UI Symbol;Noto Color Emoji" w:hAnsi="system-ui;apple-system;Segoe UI;Roboto;Helvetica Neue;Noto Sans;Liberation Sans;Arial;sans-serif;Apple Color Emoji;Segoe UI Emoji;Segoe UI Symbol;Noto Color Emoji"/>
+          <w:b w:val="false"/>
+          <w:i w:val="false"/>
+          <w:caps w:val="false"/>
+          <w:smallCaps w:val="false"/>
+          <w:color w:val="212529"/>
+          <w:spacing w:val="0"/>
+          <w:sz w:val="23"/>
+        </w:rPr>
+      </w:pPr>
+      <w:r>
+        <w:rPr>
+          <w:rFonts w:ascii="system-ui;apple-system;Segoe UI;Roboto;Helvetica Neue;Noto Sans;Liberation Sans;Arial;sans-serif;Apple Color Emoji;Segoe UI Emoji;Segoe UI Symbol;Noto Color Emoji" w:hAnsi="system-ui;apple-system;Segoe UI;Roboto;Helvetica Neue;Noto Sans;Liberation Sans;Arial;sans-serif;Apple Color Emoji;Segoe UI Emoji;Segoe UI Symbol;Noto Color Emoji"/>
+          <w:b w:val="false"/>
+          <w:i w:val="false"/>
+          <w:caps w:val="false"/>
+          <w:smallCaps w:val="false"/>
+          <w:color w:val="212529"/>
+          <w:spacing w:val="0"/>
+          <w:sz w:val="23"/>
+        </w:rPr>
+        <w:t>ADD POLE/POLD</w:t>
+      </w:r>
+    </w:p>
+    <w:p>
+      <w:pPr>
+        <w:pStyle w:val="Normal"/>
+        <w:numPr>
+          <w:ilvl w:val="0"/>
+          <w:numId w:val="3"/>
+        </w:numPr>
+        <w:ind w:hanging="0" w:left="0"/>
+        <w:rPr>
+          <w:rFonts w:ascii="system-ui;apple-system;Segoe UI;Roboto;Helvetica Neue;Noto Sans;Liberation Sans;Arial;sans-serif;Apple Color Emoji;Segoe UI Emoji;Segoe UI Symbol;Noto Color Emoji" w:hAnsi="system-ui;apple-system;Segoe UI;Roboto;Helvetica Neue;Noto Sans;Liberation Sans;Arial;sans-serif;Apple Color Emoji;Segoe UI Emoji;Segoe UI Symbol;Noto Color Emoji"/>
+          <w:b w:val="false"/>
+          <w:i w:val="false"/>
+          <w:caps w:val="false"/>
+          <w:smallCaps w:val="false"/>
+          <w:color w:val="212529"/>
+          <w:spacing w:val="0"/>
+          <w:sz w:val="23"/>
+        </w:rPr>
+      </w:pPr>
+      <w:r>
+        <w:rPr>
+          <w:rFonts w:ascii="system-ui;apple-system;Segoe UI;Roboto;Helvetica Neue;Noto Sans;Liberation Sans;Arial;sans-serif;Apple Color Emoji;Segoe UI Emoji;Segoe UI Symbol;Noto Color Emoji" w:hAnsi="system-ui;apple-system;Segoe UI;Roboto;Helvetica Neue;Noto Sans;Liberation Sans;Arial;sans-serif;Apple Color Emoji;Segoe UI Emoji;Segoe UI Symbol;Noto Color Emoji"/>
+          <w:b w:val="false"/>
+          <w:i w:val="false"/>
+          <w:caps w:val="false"/>
+          <w:smallCaps w:val="false"/>
+          <w:color w:val="212529"/>
+          <w:spacing w:val="0"/>
+          <w:sz w:val="23"/>
+        </w:rPr>
+      </w:r>
+    </w:p>
+    <w:p>
+      <w:pPr>
+        <w:pStyle w:val="Normal"/>
+        <w:rPr>
+          <w:rFonts w:ascii="system-ui;apple-system;Segoe UI;Roboto;Helvetica Neue;Noto Sans;Liberation Sans;Arial;sans-serif;Apple Color Emoji;Segoe UI Emoji;Segoe UI Symbol;Noto Color Emoji" w:hAnsi="system-ui;apple-system;Segoe UI;Roboto;Helvetica Neue;Noto Sans;Liberation Sans;Arial;sans-serif;Apple Color Emoji;Segoe UI Emoji;Segoe UI Symbol;Noto Color Emoji"/>
+          <w:b w:val="false"/>
+          <w:i w:val="false"/>
+          <w:caps w:val="false"/>
+          <w:smallCaps w:val="false"/>
+          <w:color w:val="212529"/>
+          <w:spacing w:val="0"/>
+          <w:sz w:val="23"/>
+        </w:rPr>
+      </w:pPr>
+      <w:r>
+        <w:rPr>
+          <w:rFonts w:ascii="system-ui;apple-system;Segoe UI;Roboto;Helvetica Neue;Noto Sans;Liberation Sans;Arial;sans-serif;Apple Color Emoji;Segoe UI Emoji;Segoe UI Symbol;Noto Color Emoji" w:hAnsi="system-ui;apple-system;Segoe UI;Roboto;Helvetica Neue;Noto Sans;Liberation Sans;Arial;sans-serif;Apple Color Emoji;Segoe UI Emoji;Segoe UI Symbol;Noto Color Emoji"/>
+          <w:b w:val="false"/>
+          <w:i w:val="false"/>
+          <w:caps w:val="false"/>
+          <w:smallCaps w:val="false"/>
+          <w:color w:val="212529"/>
+          <w:spacing w:val="0"/>
+          <w:sz w:val="23"/>
+        </w:rPr>
+      </w:r>
+    </w:p>
+    <w:p>
+      <w:pPr>
+        <w:pStyle w:val="Normal"/>
+        <w:rPr/>
+      </w:pPr>
+      <w:r>
+        <w:rPr/>
+      </w:r>
+    </w:p>
+    <w:p>
+      <w:pPr>
+        <w:pStyle w:val="Normal"/>
+        <w:rPr/>
+      </w:pPr>
+      <w:r>
+        <w:rPr/>
+        <w:t>look at pattern in longer dels in J and  O</w:t>
       </w:r>
     </w:p>
     <w:p>
@@ -3796,10 +4040,22 @@
     <w:p>
       <w:pPr>
         <w:pStyle w:val="Normal"/>
-        <w:rPr/>
-      </w:pPr>
-      <w:r>
-        <w:rPr/>
+        <w:rPr>
+          <w:highlight w:val="none"/>
+          <w:shd w:fill="FFFF00" w:val="clear"/>
+        </w:rPr>
+      </w:pPr>
+      <w:r>
+        <w:rPr>
+          <w:shd w:fill="FFFF00" w:val="clear"/>
+        </w:rPr>
+        <w:t>&lt;</w:t>
+      </w:r>
+      <w:r>
+        <w:rPr>
+          <w:shd w:fill="FFFF00" w:val="clear"/>
+        </w:rPr>
+        <w:t>MISSING EQUATIONS HERE&gt;</w:t>
       </w:r>
     </w:p>
     <w:p>
@@ -6098,8 +6354,8 @@
       <w:szCs w:val="24"/>
     </w:rPr>
   </w:style>
-  <w:style w:type="character" w:styleId="Bullets" w:customStyle="1">
-    <w:name w:val="Bullets"/>
+  <w:style w:type="character" w:styleId="Bulletsuser" w:customStyle="1">
+    <w:name w:val="Bullets (user)"/>
     <w:qFormat/>
     <w:rPr>
       <w:rFonts w:ascii="OpenSymbol" w:hAnsi="OpenSymbol" w:eastAsia="OpenSymbol" w:cs="OpenSymbol"/>

</xml_diff>